<commit_message>
Update Bible study notes for all languages for 2026-04-13 release
</commit_message>
<xml_diff>
--- a/fra/docx/41.content.docx
+++ b/fra/docx/41.content.docx
@@ -31424,7 +31424,7 @@
         <w:rPr>
           <w:lang w:val="fr_FR" w:bidi="fr_FR"/>
         </w:rPr>
-        <w:t xml:space="preserve">Peu importe ce que Jacques et Jean peuvent vivre, Jésus n'a pas l'autorité pour répondre à leur demande. Seul Dieu le Père le peut (voir aussi </w:t>
+        <w:t xml:space="preserve">Jésus n'acorde pas leur requête à Jacques et à Jean. Ces places appartiennent à ceux pour qui Dieu le Père les a préparées (voir aussi </w:t>
       </w:r>
       <w:hyperlink r:id="rId707">
         <w:r>
@@ -43283,7 +43283,7 @@
         <w:rPr>
           <w:lang w:val="fr_FR" w:bidi="fr_FR"/>
         </w:rPr>
-        <w:t>Marc n'explique pas ce qu'est cette abomination qui va advenir, mais les lecteurs juifs du premier siècle connaissent bien ce terme. Le prophète Daniel a prédit qu’une telle chose adviendrait dans le temple de Jérusalem (</w:t>
+        <w:t>Marc n'explique pas ce qu'est cette abomination qui va advenir, mais les lecteurs juifs du premier siècle connaissent bien ce terme. Le prophète Daniel a prédit qu’une telle chose arriverait dans le temple de Jérusalem (</w:t>
       </w:r>
       <w:hyperlink r:id="rId997">
         <w:r>
@@ -43319,7 +43319,7 @@
         <w:rPr>
           <w:lang w:val="fr_FR" w:bidi="fr_FR"/>
         </w:rPr>
-        <w:t>), et de nombreux juifs ont discerné dans les événements survenus à Jérusalem en 167–164 av. J.-C., à l'époque d’Antioche IV Épiphane, l’accomplissement de cette prophétie (le livre deutérocanonique de 1 Maccabées</w:t>
+        <w:t>). De nombreux Juifs ont vu dans les événements qui sont arrivés à Jérusalem en 167–164 av. J.-C., à l'époque d’Antioche IV Épiphane, l’accomplissement de cette prophétie (le livre deutérocanonique de 1 Maccabées</w:t>
       </w:r>
       <w:r>
         <w:rPr>
@@ -43332,7 +43332,7 @@
         <w:rPr>
           <w:lang w:val="fr_FR" w:bidi="fr_FR"/>
         </w:rPr>
-        <w:t xml:space="preserve"> écrit vers 100 av. J.-C., raconte le règne d’Antioche et décrit comment lui et ses partisans ont érigé « sur l’autel des sacrifices l’Abomination de la désolation », 1M</w:t>
+        <w:t xml:space="preserve"> écrit vers 100 av. J.-C., raconte le règne d’Antioche et décrit comment lui et ceux qui le suivaient ont érigé « sur l’autel des sacrifices l’Abomination de la désolation », 1M</w:t>
       </w:r>
       <w:r>
         <w:rPr>
@@ -43375,7 +43375,7 @@
         <w:rPr>
           <w:lang w:val="fr_FR" w:bidi="fr_FR"/>
         </w:rPr>
-        <w:t>,</w:t>
+        <w:t xml:space="preserve">, </w:t>
       </w:r>
       <w:hyperlink r:id="rId958">
         <w:r>
@@ -43411,7 +43411,7 @@
         <w:rPr>
           <w:lang w:val="fr_FR" w:bidi="fr_FR"/>
         </w:rPr>
-        <w:t>), le fait qu’il soit dit que cette dévastation a été établie à un endroit inapproprié suggère qu’elle s’est produite dans le temple de Jérusalem. - Marc a demandé à ses premiers lecteurs de prêter attention à la description de ce signe, ce qui indique qu’une réflexion approfondie et du discernement étaient nécessaires pour le comprendre. Les lecteurs de Marc sont appelés à rechercher un signe semblable à ce qui s’est passé du temps d'Antioche Épiphane. - Bien que la description de l’abominable dévastation</w:t>
+        <w:t>), le fait qu’il soit dit que cette dévastation a été établie à un endroit inapproprié suggère qu’elle s’est produite dans le temple de Jérusalem. - Marc demande à ses premiers lecteurs de prêter attention à la description de ce signe. Cela indique qu’une réflexion approfondie et du discernement étaient nécessaires pour le comprendre. Les lecteurs de Marc sont appelés à rechercher un signe semblable à ce qui s’est passé du temps d'Antioche Épiphane. - La description de l’abominable dévastation</w:t>
       </w:r>
       <w:r>
         <w:rPr>
@@ -43424,7 +43424,29 @@
         <w:rPr>
           <w:lang w:val="fr_FR" w:bidi="fr_FR"/>
         </w:rPr>
-        <w:t xml:space="preserve">soit grammaticalement neutre dans le grec, le mot qui décrit son établissement est au masculin dans la grammaire grecque, ce qui signifie qu’il est fait allusion à une personne et non pas à une chose. Plusieurs suggestions ont été faites pour déterminer l’identité de cette personne. Il peut s’agir de : (1) L’empereur Caligula, qui en 39–40 apr. J.-C. a voulu ériger une statue de sa personne au sein même du temple (Flavius Josèphe, </w:t>
+        <w:t xml:space="preserve">est grammaticalement neutre dans le texte grec, mais le mot qui décrit son établissement est au masculin. Cela suggère que l'allusion est à une personne plutôt qu'à une chose. Cependant, il n'est pas certain qu'il s'agisse d'une personne ; il pourrait tout de même s'agir d'une chose ou d'un événement. Plusieurs suggestions ont été faites pour déterminer l’identité de cette personne si c'en est une. Il peut s’agir : </w:t>
+      </w:r>
+    </w:p>
+    <w:p>
+      <w:pPr>
+        <w:pStyle w:val="ListNumber"/>
+        <w:numPr>
+          <w:ilvl w:val="0"/>
+          <w:numId w:val="14"/>
+        </w:numPr>
+        <w:spacing w:line="240" w:lineRule="auto"/>
+        <w:ind w:left="720"/>
+      </w:pPr>
+      <w:r>
+        <w:rPr>
+          <w:lang w:val="fr_FR" w:bidi="fr_FR"/>
+        </w:rPr>
+      </w:r>
+      <w:r>
+        <w:rPr>
+          <w:lang w:val="fr_FR" w:bidi="fr_FR"/>
+        </w:rPr>
+        <w:t xml:space="preserve">De l’empereur Caligula, qui a voulu ériger une statue de sa personne au sein même du Temple en 39–40 apr. J.-C. (Flavius Josèphe, </w:t>
       </w:r>
       <w:r>
         <w:rPr>
@@ -43437,7 +43459,25 @@
         <w:rPr>
           <w:lang w:val="fr_FR" w:bidi="fr_FR"/>
         </w:rPr>
-        <w:t xml:space="preserve"> 12.8.2–3) ; (2) Ponce Pilate (26–36 apr. J.-C.), qui a exigé de ses soldats romains de marcher en exhibant leurs étendards en Judée, ce qui était considéré comme de l’idolâtrie par les Juifs (Flavius Josèphe, </w:t>
+        <w:t xml:space="preserve"> 12.8.2–3).</w:t>
+      </w:r>
+    </w:p>
+    <w:p>
+      <w:pPr>
+        <w:pStyle w:val="ListNumber"/>
+        <w:spacing w:line="240" w:lineRule="auto"/>
+        <w:ind w:left="720"/>
+      </w:pPr>
+      <w:r>
+        <w:rPr>
+          <w:lang w:val="fr_FR" w:bidi="fr_FR"/>
+        </w:rPr>
+      </w:r>
+      <w:r>
+        <w:rPr>
+          <w:lang w:val="fr_FR" w:bidi="fr_FR"/>
+        </w:rPr>
+        <w:t xml:space="preserve">De Ponce Pilate (26–36 apr. J.-C.), qui a exigé que ses soldats romains marchent en portant leurs étendards en Judée. Or, cela était considéré comme de l’idolâtrie par les Juifs (Flavius Josèphe, </w:t>
       </w:r>
       <w:r>
         <w:rPr>
@@ -43450,7 +43490,25 @@
         <w:rPr>
           <w:lang w:val="fr_FR" w:bidi="fr_FR"/>
         </w:rPr>
-        <w:t xml:space="preserve"> 2.9. 2–3) ; (3) Les zélotes en 69–70 apr. J.-C, qui ont commis des atrocités dans le temple en désignant une personne non qualifiée pour se charger de l’office de grand-prêtre de la nation, et qui « élevèrent leur insolence contre Dieu et portèrent leurs pieds souillés dans le sanctuaire » (Flavius Josèphe, </w:t>
+        <w:t xml:space="preserve"> 2.9. 2–3).</w:t>
+      </w:r>
+    </w:p>
+    <w:p>
+      <w:pPr>
+        <w:pStyle w:val="ListNumber"/>
+        <w:spacing w:line="240" w:lineRule="auto"/>
+        <w:ind w:left="720"/>
+      </w:pPr>
+      <w:r>
+        <w:rPr>
+          <w:lang w:val="fr_FR" w:bidi="fr_FR"/>
+        </w:rPr>
+      </w:r>
+      <w:r>
+        <w:rPr>
+          <w:lang w:val="fr_FR" w:bidi="fr_FR"/>
+        </w:rPr>
+        <w:t xml:space="preserve">Des zélotes en 69–70 apr. J.-C, qui ont commis des atrocités dans le Temple en désignant une personne non qualifiée pour se charger de l’office de souverain sacrificateur de la nation. Ils « élevèrent leur insolence contre Dieu et portèrent leurs pieds souillés dans le sanctuaire » (Flavius Josèphe, </w:t>
       </w:r>
       <w:r>
         <w:rPr>
@@ -43463,7 +43521,25 @@
         <w:rPr>
           <w:lang w:val="fr_FR" w:bidi="fr_FR"/>
         </w:rPr>
-        <w:t xml:space="preserve"> 4.6) ; (4) Le général romain Titus qui, après avoir conquis Jérusalem en 70 apr. J.-C., a également forcé l'entrée du Temple (Flavius Josèphe, </w:t>
+        <w:t xml:space="preserve"> 4.6).</w:t>
+      </w:r>
+    </w:p>
+    <w:p>
+      <w:pPr>
+        <w:pStyle w:val="ListNumber"/>
+        <w:spacing w:line="240" w:lineRule="auto"/>
+        <w:ind w:left="720"/>
+      </w:pPr>
+      <w:r>
+        <w:rPr>
+          <w:lang w:val="fr_FR" w:bidi="fr_FR"/>
+        </w:rPr>
+      </w:r>
+      <w:r>
+        <w:rPr>
+          <w:lang w:val="fr_FR" w:bidi="fr_FR"/>
+        </w:rPr>
+        <w:t xml:space="preserve">Du général romain Titus qui, après avoir conquis Jérusalem en 70 apr. J.-C., a également forcé l'entrée du Temple (Flavius Josèphe, </w:t>
       </w:r>
       <w:r>
         <w:rPr>
@@ -43476,7 +43552,25 @@
         <w:rPr>
           <w:lang w:val="fr_FR" w:bidi="fr_FR"/>
         </w:rPr>
-        <w:t xml:space="preserve"> 6.4.7) ; (5) les soldats de Titus, qui ont dressé leurs étendards dans le temple, y ont offert des sacrifices et ont proclamé Titus empereur (Flavius Josèphe, </w:t>
+        <w:t xml:space="preserve"> 6.4.7).</w:t>
+      </w:r>
+    </w:p>
+    <w:p>
+      <w:pPr>
+        <w:pStyle w:val="ListNumber"/>
+        <w:spacing w:line="240" w:lineRule="auto"/>
+        <w:ind w:left="720"/>
+      </w:pPr>
+      <w:r>
+        <w:rPr>
+          <w:lang w:val="fr_FR" w:bidi="fr_FR"/>
+        </w:rPr>
+      </w:r>
+      <w:r>
+        <w:rPr>
+          <w:lang w:val="fr_FR" w:bidi="fr_FR"/>
+        </w:rPr>
+        <w:t xml:space="preserve">Des soldats de Titus, qui ont dressé leurs étendards dans le Temple, y ont offert des sacrifices et proclamé Titus empereur (Flavius Josèphe, </w:t>
       </w:r>
       <w:r>
         <w:rPr>
@@ -43489,7 +43583,43 @@
         <w:rPr>
           <w:lang w:val="fr_FR" w:bidi="fr_FR"/>
         </w:rPr>
-        <w:t xml:space="preserve"> 6.6.1) ; (6) la destruction du Temple lui-même en 70 apr. J.-C. ; ou (7) un événement futur impliquant la venue de l'antéchrist (voir </w:t>
+        <w:t xml:space="preserve"> 6.6.1).</w:t>
+      </w:r>
+    </w:p>
+    <w:p>
+      <w:pPr>
+        <w:pStyle w:val="ListNumber"/>
+        <w:spacing w:line="240" w:lineRule="auto"/>
+        <w:ind w:left="720"/>
+      </w:pPr>
+      <w:r>
+        <w:rPr>
+          <w:lang w:val="fr_FR" w:bidi="fr_FR"/>
+        </w:rPr>
+      </w:r>
+      <w:r>
+        <w:rPr>
+          <w:lang w:val="fr_FR" w:bidi="fr_FR"/>
+        </w:rPr>
+        <w:t>De la destruction du Temple lui-même en 70 apr. J.-C.</w:t>
+      </w:r>
+    </w:p>
+    <w:p>
+      <w:pPr>
+        <w:pStyle w:val="ListNumber"/>
+        <w:spacing w:line="240" w:lineRule="auto"/>
+        <w:ind w:left="720"/>
+      </w:pPr>
+      <w:r>
+        <w:rPr>
+          <w:lang w:val="fr_FR" w:bidi="fr_FR"/>
+        </w:rPr>
+      </w:r>
+      <w:r>
+        <w:rPr>
+          <w:lang w:val="fr_FR" w:bidi="fr_FR"/>
+        </w:rPr>
+        <w:t xml:space="preserve">D'un événement futur lié à la venue de l'antéchrist (voir </w:t>
       </w:r>
       <w:hyperlink r:id="rId1000">
         <w:r>
@@ -43507,7 +43637,21 @@
         <w:rPr>
           <w:lang w:val="fr_FR" w:bidi="fr_FR"/>
         </w:rPr>
-        <w:t>). Plusieurs théories peuvent être éliminées en raison du contexte et de la provenance de l'expression. Dans Daniel et 1 Maccabées,</w:t>
+        <w:t>).</w:t>
+      </w:r>
+    </w:p>
+    <w:p>
+      <w:pPr/>
+      <w:r>
+        <w:rPr>
+          <w:lang w:val="fr_FR" w:bidi="fr_FR"/>
+        </w:rPr>
+      </w:r>
+      <w:r>
+        <w:rPr>
+          <w:lang w:val="fr_FR" w:bidi="fr_FR"/>
+        </w:rPr>
+        <w:t>Plusieurs théories peuvent être éliminées en raison du contexte et de la source de l'expression. Dans Daniel et 1 Maccabées,</w:t>
       </w:r>
       <w:r>
         <w:rPr>
@@ -43520,7 +43664,7 @@
         <w:rPr>
           <w:lang w:val="fr_FR" w:bidi="fr_FR"/>
         </w:rPr>
-        <w:t xml:space="preserve">l'expression concerne le temple, son autel et ses rituels sacrificiels. Dans </w:t>
+        <w:t xml:space="preserve">l'expression concerne le Temple, son autel et ses rituels sacrificiels. Dans </w:t>
       </w:r>
       <w:hyperlink r:id="rId968">
         <w:r>
@@ -43538,7 +43682,7 @@
         <w:rPr>
           <w:lang w:val="fr_FR" w:bidi="fr_FR"/>
         </w:rPr>
-        <w:t xml:space="preserve">, il s'agit d'un signe pour que les gens fuient la Judée, et ce à quoi il fait référence doit se produire alors qu'il est encore temps de fuir (c'est-à-dire avant que l'armée romaine n'occupe la Judée et n'assiège Jérusalem). Les évènements décrits dans les explications (1) et (2) sont advenus trop tôt pour avoir servi de signe reconnaissable indiquant la nécessité de fuir la Judée. Aussi, ces hommes n'ont pas réellement souillé le temple, et les chrétiens n'ont pas fui Jérusalem en cette période. Les explications (4) à (6) sont trop tardives, car il n'y avait plus vraiment de possibilité de fuite après l'entrée de Titus à Jérusalem. Dans l'explication 7, aucune référence n'est faite à la destruction de Jérusalem en 70 apr. J.-C., ce qui est le sujet de </w:t>
+        <w:t xml:space="preserve">, il s'agit d'un signe pour que les gens fuient la Judée, et ce à quoi il fait référence doit se produire alors qu'il est encore temps de fuir (c'est-à-dire avant que l'armée romaine occupe la Judée et assiège Jérusalem). Les évènements décrits dans les explications (1) et (2) sont arrivés trop tôt pour avoir servi de signe reconnaissable indiquant la nécessité de fuir la Judée. Aussi, ces hommes n'ont pas réellement souillé le Temple, et les chrétiens n'ont pas fui Jérusalem en cette période. Les explications (4) à (6) sont trop tardives, car il n'y avait plus vraiment de possibilité de fuite après l'entrée de Titus à Jérusalem. Dans l'explication (7), aucune référence n'est faite à la destruction de Jérusalem en 70 apr. J.-C., ce qui est le sujet de </w:t>
       </w:r>
       <w:hyperlink r:id="rId968">
         <w:r>
@@ -43549,14 +43693,14 @@
             <w:color w:val="0000EE"/>
             <w:u w:val="single"/>
           </w:rPr>
-          <w:t>13.14–20</w:t>
-        </w:r>
-      </w:hyperlink>
-      <w:r>
-        <w:rPr>
-          <w:lang w:val="fr_FR" w:bidi="fr_FR"/>
-        </w:rPr>
-        <w:t xml:space="preserve">, et la venue de l'antéchrist ne doit pas se limiter au territoire de Judée. En réalité, l'explication qui convient le mieux est la (3) : les zélotes ont commis leur profanation en 69–70 après J.-C., peu avant que Titus n'assiège Jérusalem, ce qui a pu offrir aux chrétiens une brève occasion de quitter Jérusalem avant qu'elle ne soit assiégée. De plus, ils ont agi en profanant le lieu saint du temple. Cette interprétation permet également de distinguer le signe de la catastrophe à venir (l'abominable dévastation) de la catastrophe elle-même (la destruction de Jérusalem et du temple). - Dès l'apparition de l'abominable dévastation, les habitants de la Judée sont appelés à fuir vers les collines. Eusèbe, un historien de l'Église primitive, mentionne un oracle prophétique donné à l'Église de Jérusalem qui l'a amenée à fuir la ville avant sa destruction (Eusèbe de Césarée, </w:t>
+          <w:t>13.14–20.</w:t>
+        </w:r>
+      </w:hyperlink>
+      <w:r>
+        <w:rPr>
+          <w:lang w:val="fr_FR" w:bidi="fr_FR"/>
+        </w:rPr>
+        <w:t xml:space="preserve"> De plus, la venue de l'antéchrist ne doit pas se limiter au territoire de Judée. En réalité, l'explication qui convient le mieux est la (3) : Les zélotes ont commis leur profanation en 69–70 apr. J.-C., peu avant que Titus assiège Jérusalem. Cela a d'ailleurs pu offrir aux chrétiens une brève occasion de quitter Jérusalem avant qu'elle soit assiégée. De plus, ils ont agi en profanant le lieu saint du Temple. Cette interprétation permet également de distinguer le signe de la catastrophe à venir (l'abominable dévastation) de la catastrophe elle-même (la destruction de Jérusalem et du Temple). - Dès l'apparition de l'abominable dévastation, les habitants de la Judée sont appelés à fuir vers les collines. Eusèbe (historien de l'Église primitive), mentionne un oracle prophétique donné à l'Église de Jérusalem, qui l'a amenée à fuir la ville avant sa destruction (Eusèbe de Césarée, </w:t>
       </w:r>
       <w:r>
         <w:rPr>
@@ -57364,6 +57508,12 @@
   </w:num>
   <w:num w:numId="13" w16cid:durableId="592781308">
     <w:abstractNumId w:val="11"/>
+  </w:num>
+  <w:num w:numId="14">
+    <w:abstractNumId w:val="3"/>
+    <w:lvlOverride w:ilvl="0">
+      <w:startOverride w:val="1"/>
+    </w:lvlOverride>
   </w:num>
   <w:numIdMacAtCleanup w:val="10"/>
 </w:numbering>

</xml_diff>